<commit_message>
v2.522.30: s9.25/a9.25 recaps with fall races, September winner, CTPs, fellowship
Kerry awarded Tuesday's GG points. Fall races and the September monthly
(Youngs 64, Mazanec 62) re-fetched; Austin CTPs (Schneider #4, Moore #7)
and Schneider's $254 night; SA fellowship 8 at Aldaco's. Word files
re-rendered.

Co-Authored-By: Claude Opus 5.5 <noreply@anthropic.com>
Claude-Session: https://claude.ai/code/session_019AxFcHia31na5NB3RLsF2W
</commit_message>
<xml_diff>
--- a/transaction-tracker/docs/claude/recaps/TGF_Recap_a9.25_Star_Ranch.docx
+++ b/transaction-tracker/docs/claude/recaps/TGF_Recap_a9.25_Star_Ranch.docx
@@ -69,7 +69,7 @@
         </w:rPr>
         <w:t xml:space="preserve"> shot 48. Tuesday at </w:t>
       </w:r>
-      <w:hyperlink w:history="1" r:id="rIdu_9ixj9420zvjdkxf9yd8">
+      <w:hyperlink w:history="1" r:id="rIdooz3qropqbyjeyxldsykb">
         <w:r>
           <w:rPr>
             <w:rStyle w:val="Hyperlink"/>
@@ -88,7 +88,7 @@
           <w:sz w:val="22"/>
           <w:szCs w:val="22"/>
         </w:rPr>
-        <w:t xml:space="preserve"> he shot 38 / 32 net (−3) from the Blues — ten shots better — with a birdie 2 on the 154-yard fourth, pars on 2, 3, 7, 8 and 9, and net birdies on 2, 3, 4, 8 and 9. That won Individual Net LOW Flight outright, three skins, and Team Net with Kelly </w:t>
+        <w:t xml:space="preserve"> he shot 38 / 32 net (−3) from the Blues — ten shots better — with a birdie 2 on the 154-yard fourth (Closest to the Pin there too), pars on 2, 3, 7, 8 and 9, and net birdies on 2, 3, 4, 8 and 9. That won Individual Net LOW Flight outright, three skins, and Team Net with Kelly </w:t>
       </w:r>
       <w:r>
         <w:rPr>
@@ -144,7 +144,7 @@
         </w:rPr>
         <w:t xml:space="preserve"> at 32. His 12 points made him Austin's City MVP and the TGF MVP for the night, two clear of San Antonio's best (Mike Murphy, 10 at </w:t>
       </w:r>
-      <w:hyperlink w:history="1" r:id="rIdrkwtorwguggghuxliyogd">
+      <w:hyperlink w:history="1" r:id="rIdhhnjyr4haar3uk6yavmdo">
         <w:r>
           <w:rPr>
             <w:rStyle w:val="Hyperlink"/>
@@ -173,7 +173,7 @@
           <w:sz w:val="22"/>
           <w:szCs w:val="22"/>
         </w:rPr>
-        <w:t xml:space="preserve">A $235 night — the biggest Tuesday check of the fall.</w:t>
+        <w:t xml:space="preserve">A $254 night — the biggest Tuesday check of the fall.</w:t>
       </w:r>
     </w:p>
     <w:p>
@@ -222,7 +222,7 @@
           <w:sz w:val="22"/>
           <w:szCs w:val="22"/>
         </w:rPr>
-        <w:t xml:space="preserve"> tied for first in the HIGH Flight at 43 / 35 net (E), and Kyle birdied 8 for a skin on top of his Team Net share. John </w:t>
+        <w:t xml:space="preserve"> tied for first in the HIGH Flight at 43 / 35 net (E). Kyle birdied 8 for a skin on top of his Team Net share, and Dion took Closest to the Pin on 7. John </w:t>
       </w:r>
       <w:r>
         <w:rPr>
@@ -314,7 +314,7 @@
       <w:pPr>
         <w:spacing w:after="160" w:line="300"/>
       </w:pPr>
-      <w:hyperlink w:history="1" r:id="rId5b0pka7mztzqgdaypwb_w">
+      <w:hyperlink w:history="1" r:id="rIdg0jwopsh-pjfua4mimxdq">
         <w:r>
           <w:rPr>
             <w:rStyle w:val="Hyperlink"/>
@@ -393,7 +393,7 @@
           <w:sz w:val="22"/>
           <w:szCs w:val="22"/>
         </w:rPr>
-        <w:t xml:space="preserve"> second at 48, then Lou </w:t>
+        <w:t xml:space="preserve"> second at 50. Lou </w:t>
       </w:r>
       <w:r>
         <w:rPr>
@@ -411,7 +411,7 @@
           <w:sz w:val="22"/>
           <w:szCs w:val="22"/>
         </w:rPr>
-        <w:t xml:space="preserve"> 24 and Chris </w:t>
+        <w:t xml:space="preserve"> jumped from 24 to 36 with Tuesday's win, and Chris </w:t>
       </w:r>
       <w:r>
         <w:rPr>
@@ -429,9 +429,9 @@
           <w:sz w:val="22"/>
           <w:szCs w:val="22"/>
         </w:rPr>
-        <w:t xml:space="preserve"> 20. Best 6 of the fall Tuesdays plus the Fall Championship at Kissing Tree on Oct 31. Your points are being tallied; activate them by BUYING IN. Green in the standings means you are already in. </w:t>
-      </w:r>
-      <w:hyperlink w:history="1" r:id="rIdo_m7gudpuifdxy_jjkoxg">
+        <w:t xml:space="preserve"> is at 28. Best 6 of the fall Tuesdays plus the Fall Championship at Kissing Tree on Oct 31. Your points are being tallied; activate them by BUYING IN. Green in the standings means you are already in. </w:t>
+      </w:r>
+      <w:hyperlink w:history="1" r:id="rId7gg21fubojiqsqftyids8">
         <w:r>
           <w:rPr>
             <w:rStyle w:val="Hyperlink"/>
@@ -474,26 +474,45 @@
           <w:sz w:val="22"/>
           <w:szCs w:val="22"/>
         </w:rPr>
-        <w:t xml:space="preserve">Every member is in, no buy-in. Winner takes all — $1 per TGF member at month end, $138. </w:t>
-      </w:r>
-      <w:r>
-        <w:rPr>
-          <w:rFonts w:ascii="Arial" w:cs="Arial" w:eastAsia="Arial" w:hAnsi="Arial"/>
-          <w:sz w:val="22"/>
-          <w:szCs w:val="22"/>
-          <w:highlight w:val="yellow"/>
-        </w:rPr>
-        <w:t xml:space="preserve">[__ September winner — Luke YOUNGS (57) went into the last Tuesday one point behind San Antonio's Luke Mazanec (58) __]</w:t>
-      </w:r>
-      <w:r>
-        <w:rPr>
-          <w:rFonts w:ascii="Arial" w:cs="Arial" w:eastAsia="Arial" w:hAnsi="Arial"/>
-          <w:sz w:val="22"/>
-          <w:szCs w:val="22"/>
-        </w:rPr>
-        <w:t xml:space="preserve"> October starts fresh Tuesday. </w:t>
-      </w:r>
-      <w:hyperlink w:history="1" r:id="rId5-0whyfwbqfi0o3jnpkz3">
+        <w:t xml:space="preserve">Every member is in, no buy-in. Winner takes all — $1 per TGF member at month end. Luke </w:t>
+      </w:r>
+      <w:r>
+        <w:rPr>
+          <w:rFonts w:ascii="Arial" w:cs="Arial" w:eastAsia="Arial" w:hAnsi="Arial"/>
+          <w:b/>
+          <w:bCs/>
+          <w:sz w:val="22"/>
+          <w:szCs w:val="22"/>
+        </w:rPr>
+        <w:t xml:space="preserve">YOUNGS</w:t>
+      </w:r>
+      <w:r>
+        <w:rPr>
+          <w:rFonts w:ascii="Arial" w:cs="Arial" w:eastAsia="Arial" w:hAnsi="Arial"/>
+          <w:sz w:val="22"/>
+          <w:szCs w:val="22"/>
+        </w:rPr>
+        <w:t xml:space="preserve"> went into the last Tuesday a point behind San Antonio's Luke Mazanec, 57 to 58, outscored him seven to four at Star Ranch, and </w:t>
+      </w:r>
+      <w:r>
+        <w:rPr>
+          <w:rFonts w:ascii="Arial" w:cs="Arial" w:eastAsia="Arial" w:hAnsi="Arial"/>
+          <w:b/>
+          <w:bCs/>
+          <w:sz w:val="22"/>
+          <w:szCs w:val="22"/>
+        </w:rPr>
+        <w:t xml:space="preserve">takes September, 64 to 62 — $138</w:t>
+      </w:r>
+      <w:r>
+        <w:rPr>
+          <w:rFonts w:ascii="Arial" w:cs="Arial" w:eastAsia="Arial" w:hAnsi="Arial"/>
+          <w:sz w:val="22"/>
+          <w:szCs w:val="22"/>
+        </w:rPr>
+        <w:t xml:space="preserve">. October starts fresh Tuesday. </w:t>
+      </w:r>
+      <w:hyperlink w:history="1" r:id="rIdkn5ffi2vciyccgm7nxlpg">
         <w:r>
           <w:rPr>
             <w:rStyle w:val="Hyperlink"/>
@@ -713,7 +732,7 @@
         </w:rPr>
         <w:t xml:space="preserve"> | 5:00p Shot | </w:t>
       </w:r>
-      <w:hyperlink w:history="1" r:id="rIduusroh0ojkqrgiedxogdk">
+      <w:hyperlink w:history="1" r:id="rIdvejyynm8l9vy6ormuc-ga">
         <w:r>
           <w:rPr>
             <w:rStyle w:val="Hyperlink"/>

</xml_diff>

<commit_message>
v2.522.35: recap drafts render Kerry's sent layout; lessons 52-64 from his s9.25 send
Kerry pasted his s9.25 Canyon Springs send: "Learn from my edits.
Including all formatting and spacing." recap_mail.py and recap_docx.js
now produce his shape: one empty paragraph between blocks, a plain rule
above each section head and a blank line under it, nothing before a rule,
*** for a headless rule, {green} text for the Hole-in-One line. Lessons
52-64 in event-recaps.md (whole name bold with CAPS surname, both
chapters' member standings links, POINTS IS FINAL, BUYING IN link,
good conversation). Austin's Event Results page is pages/5790752; the
drafts had linked SA's schedule page. SA section is now the sent text of
record; the Austin draft is revised to the lessons.

Co-Authored-By: Claude Opus 5.5 <noreply@anthropic.com>
Claude-Session: https://claude.ai/code/session_019AxFcHia31na5NB3RLsF2W
</commit_message>
<xml_diff>
--- a/transaction-tracker/docs/claude/recaps/TGF_Recap_a9.25_Star_Ranch.docx
+++ b/transaction-tracker/docs/claude/recaps/TGF_Recap_a9.25_Star_Ranch.docx
@@ -28,7 +28,7 @@
     </w:p>
     <w:p>
       <w:pPr>
-        <w:spacing w:after="160" w:line="300"/>
+        <w:spacing w:after="0" w:line="276"/>
       </w:pPr>
       <w:r>
         <w:rPr>
@@ -41,25 +41,38 @@
     </w:p>
     <w:p>
       <w:pPr>
-        <w:spacing w:after="160" w:line="300"/>
-      </w:pPr>
-      <w:r>
-        <w:rPr>
-          <w:rFonts w:ascii="Arial" w:cs="Arial" w:eastAsia="Arial" w:hAnsi="Arial"/>
-          <w:sz w:val="22"/>
-          <w:szCs w:val="22"/>
-        </w:rPr>
-        <w:t xml:space="preserve">Last Tuesday at Teravista, Lou </w:t>
-      </w:r>
-      <w:r>
-        <w:rPr>
-          <w:rFonts w:ascii="Arial" w:cs="Arial" w:eastAsia="Arial" w:hAnsi="Arial"/>
-          <w:b/>
-          <w:bCs/>
-          <w:sz w:val="22"/>
-          <w:szCs w:val="22"/>
-        </w:rPr>
-        <w:t xml:space="preserve">SCHNEIDER</w:t>
+        <w:spacing w:after="0" w:line="276"/>
+      </w:pPr>
+      <w:r>
+        <w:rPr>
+          <w:rFonts w:ascii="Arial" w:cs="Arial" w:eastAsia="Arial" w:hAnsi="Arial"/>
+          <w:sz w:val="22"/>
+          <w:szCs w:val="22"/>
+        </w:rPr>
+        <w:t xml:space="preserve"/>
+      </w:r>
+    </w:p>
+    <w:p>
+      <w:pPr>
+        <w:spacing w:after="0" w:line="276"/>
+      </w:pPr>
+      <w:r>
+        <w:rPr>
+          <w:rFonts w:ascii="Arial" w:cs="Arial" w:eastAsia="Arial" w:hAnsi="Arial"/>
+          <w:sz w:val="22"/>
+          <w:szCs w:val="22"/>
+        </w:rPr>
+        <w:t xml:space="preserve">Last Tuesday at Teravista, </w:t>
+      </w:r>
+      <w:r>
+        <w:rPr>
+          <w:rFonts w:ascii="Arial" w:cs="Arial" w:eastAsia="Arial" w:hAnsi="Arial"/>
+          <w:b/>
+          <w:bCs/>
+          <w:sz w:val="22"/>
+          <w:szCs w:val="22"/>
+        </w:rPr>
+        <w:t xml:space="preserve">Lou SCHNEIDER</w:t>
       </w:r>
       <w:r>
         <w:rPr>
@@ -69,7 +82,7 @@
         </w:rPr>
         <w:t xml:space="preserve"> shot 48. Tuesday at </w:t>
       </w:r>
-      <w:hyperlink w:history="1" r:id="rIdooz3qropqbyjeyxldsykb">
+      <w:hyperlink w:history="1" r:id="rId2etlouyoeybipy_i5deei">
         <w:r>
           <w:rPr>
             <w:rStyle w:val="Hyperlink"/>
@@ -88,63 +101,81 @@
           <w:sz w:val="22"/>
           <w:szCs w:val="22"/>
         </w:rPr>
-        <w:t xml:space="preserve"> he shot 38 / 32 net (−3) from the Blues — ten shots better — with a birdie 2 on the 154-yard fourth (Closest to the Pin there too), pars on 2, 3, 7, 8 and 9, and net birdies on 2, 3, 4, 8 and 9. That won Individual Net LOW Flight outright, three skins, and Team Net with Kelly </w:t>
-      </w:r>
-      <w:r>
-        <w:rPr>
-          <w:rFonts w:ascii="Arial" w:cs="Arial" w:eastAsia="Arial" w:hAnsi="Arial"/>
-          <w:b/>
-          <w:bCs/>
-          <w:sz w:val="22"/>
-          <w:szCs w:val="22"/>
-        </w:rPr>
-        <w:t xml:space="preserve">BARNA</w:t>
-      </w:r>
-      <w:r>
-        <w:rPr>
-          <w:rFonts w:ascii="Arial" w:cs="Arial" w:eastAsia="Arial" w:hAnsi="Arial"/>
-          <w:sz w:val="22"/>
-          <w:szCs w:val="22"/>
-        </w:rPr>
-        <w:t xml:space="preserve">, Kyle </w:t>
-      </w:r>
-      <w:r>
-        <w:rPr>
-          <w:rFonts w:ascii="Arial" w:cs="Arial" w:eastAsia="Arial" w:hAnsi="Arial"/>
-          <w:b/>
-          <w:bCs/>
-          <w:sz w:val="22"/>
-          <w:szCs w:val="22"/>
-        </w:rPr>
-        <w:t xml:space="preserve">COMPTON</w:t>
-      </w:r>
-      <w:r>
-        <w:rPr>
-          <w:rFonts w:ascii="Arial" w:cs="Arial" w:eastAsia="Arial" w:hAnsi="Arial"/>
-          <w:sz w:val="22"/>
-          <w:szCs w:val="22"/>
-        </w:rPr>
-        <w:t xml:space="preserve"> and Matt </w:t>
-      </w:r>
-      <w:r>
-        <w:rPr>
-          <w:rFonts w:ascii="Arial" w:cs="Arial" w:eastAsia="Arial" w:hAnsi="Arial"/>
-          <w:b/>
-          <w:bCs/>
-          <w:sz w:val="22"/>
-          <w:szCs w:val="22"/>
-        </w:rPr>
-        <w:t xml:space="preserve">SHARP</w:t>
-      </w:r>
-      <w:r>
-        <w:rPr>
-          <w:rFonts w:ascii="Arial" w:cs="Arial" w:eastAsia="Arial" w:hAnsi="Arial"/>
-          <w:sz w:val="22"/>
-          <w:szCs w:val="22"/>
-        </w:rPr>
-        <w:t xml:space="preserve"> at 32. His 12 points made him Austin's City MVP and the TGF MVP for the night, two clear of San Antonio's best (Mike Murphy, 10 at </w:t>
-      </w:r>
-      <w:hyperlink w:history="1" r:id="rIdhhnjyr4haar3uk6yavmdo">
+        <w:t xml:space="preserve"> he shot 38 / 32 net (−3) from the Blues — ten shots better — with a birdie 2 on the 154-yard fourth (Closest to the Pin there too), pars on 2, 3, 7, 8 and 9, and net birdies on 2, 3, 4, 8 and 9. That won Individual Net LOW Flight outright, three skins, and Team Net with </w:t>
+      </w:r>
+      <w:r>
+        <w:rPr>
+          <w:rFonts w:ascii="Arial" w:cs="Arial" w:eastAsia="Arial" w:hAnsi="Arial"/>
+          <w:b/>
+          <w:bCs/>
+          <w:sz w:val="22"/>
+          <w:szCs w:val="22"/>
+        </w:rPr>
+        <w:t xml:space="preserve">Kelly BARNA</w:t>
+      </w:r>
+      <w:r>
+        <w:rPr>
+          <w:rFonts w:ascii="Arial" w:cs="Arial" w:eastAsia="Arial" w:hAnsi="Arial"/>
+          <w:sz w:val="22"/>
+          <w:szCs w:val="22"/>
+        </w:rPr>
+        <w:t xml:space="preserve">, </w:t>
+      </w:r>
+      <w:r>
+        <w:rPr>
+          <w:rFonts w:ascii="Arial" w:cs="Arial" w:eastAsia="Arial" w:hAnsi="Arial"/>
+          <w:b/>
+          <w:bCs/>
+          <w:sz w:val="22"/>
+          <w:szCs w:val="22"/>
+        </w:rPr>
+        <w:t xml:space="preserve">Kyle COMPTON</w:t>
+      </w:r>
+      <w:r>
+        <w:rPr>
+          <w:rFonts w:ascii="Arial" w:cs="Arial" w:eastAsia="Arial" w:hAnsi="Arial"/>
+          <w:sz w:val="22"/>
+          <w:szCs w:val="22"/>
+        </w:rPr>
+        <w:t xml:space="preserve"> and </w:t>
+      </w:r>
+      <w:r>
+        <w:rPr>
+          <w:rFonts w:ascii="Arial" w:cs="Arial" w:eastAsia="Arial" w:hAnsi="Arial"/>
+          <w:b/>
+          <w:bCs/>
+          <w:sz w:val="22"/>
+          <w:szCs w:val="22"/>
+        </w:rPr>
+        <w:t xml:space="preserve">Matt SHARP</w:t>
+      </w:r>
+      <w:r>
+        <w:rPr>
+          <w:rFonts w:ascii="Arial" w:cs="Arial" w:eastAsia="Arial" w:hAnsi="Arial"/>
+          <w:sz w:val="22"/>
+          <w:szCs w:val="22"/>
+        </w:rPr>
+        <w:t xml:space="preserve"> at 32. His 12 points made him Austin's City MVP and the TGF MVP for the night, two clear of San Antonio's best (</w:t>
+      </w:r>
+      <w:r>
+        <w:rPr>
+          <w:rFonts w:ascii="Arial" w:cs="Arial" w:eastAsia="Arial" w:hAnsi="Arial"/>
+          <w:b/>
+          <w:bCs/>
+          <w:sz w:val="22"/>
+          <w:szCs w:val="22"/>
+        </w:rPr>
+        <w:t xml:space="preserve">Mike MURPHY</w:t>
+      </w:r>
+      <w:r>
+        <w:rPr>
+          <w:rFonts w:ascii="Arial" w:cs="Arial" w:eastAsia="Arial" w:hAnsi="Arial"/>
+          <w:sz w:val="22"/>
+          <w:szCs w:val="22"/>
+        </w:rPr>
+        <w:t xml:space="preserve">, 10 at </w:t>
+      </w:r>
+      <w:hyperlink w:history="1" r:id="rIdjrilkb4dcayf14ha5mnys">
         <w:r>
           <w:rPr>
             <w:rStyle w:val="Hyperlink"/>
@@ -178,61 +209,66 @@
     </w:p>
     <w:p>
       <w:pPr>
-        <w:spacing w:after="160" w:line="300"/>
-      </w:pPr>
-      <w:r>
-        <w:rPr>
-          <w:rFonts w:ascii="Arial" w:cs="Arial" w:eastAsia="Arial" w:hAnsi="Arial"/>
-          <w:sz w:val="22"/>
-          <w:szCs w:val="22"/>
-        </w:rPr>
-        <w:t xml:space="preserve">Kyle </w:t>
-      </w:r>
-      <w:r>
-        <w:rPr>
-          <w:rFonts w:ascii="Arial" w:cs="Arial" w:eastAsia="Arial" w:hAnsi="Arial"/>
-          <w:b/>
-          <w:bCs/>
-          <w:sz w:val="22"/>
-          <w:szCs w:val="22"/>
-        </w:rPr>
-        <w:t xml:space="preserve">COMPTON</w:t>
-      </w:r>
-      <w:r>
-        <w:rPr>
-          <w:rFonts w:ascii="Arial" w:cs="Arial" w:eastAsia="Arial" w:hAnsi="Arial"/>
-          <w:sz w:val="22"/>
-          <w:szCs w:val="22"/>
-        </w:rPr>
-        <w:t xml:space="preserve"> and Dion </w:t>
-      </w:r>
-      <w:r>
-        <w:rPr>
-          <w:rFonts w:ascii="Arial" w:cs="Arial" w:eastAsia="Arial" w:hAnsi="Arial"/>
-          <w:b/>
-          <w:bCs/>
-          <w:sz w:val="22"/>
-          <w:szCs w:val="22"/>
-        </w:rPr>
-        <w:t xml:space="preserve">MOORE</w:t>
-      </w:r>
-      <w:r>
-        <w:rPr>
-          <w:rFonts w:ascii="Arial" w:cs="Arial" w:eastAsia="Arial" w:hAnsi="Arial"/>
-          <w:sz w:val="22"/>
-          <w:szCs w:val="22"/>
-        </w:rPr>
-        <w:t xml:space="preserve"> tied for first in the HIGH Flight at 43 / 35 net (E). Kyle birdied 8 for a skin on top of his Team Net share, and Dion took Closest to the Pin on 7. John </w:t>
-      </w:r>
-      <w:r>
-        <w:rPr>
-          <w:rFonts w:ascii="Arial" w:cs="Arial" w:eastAsia="Arial" w:hAnsi="Arial"/>
-          <w:b/>
-          <w:bCs/>
-          <w:sz w:val="22"/>
-          <w:szCs w:val="22"/>
-        </w:rPr>
-        <w:t xml:space="preserve">WADE</w:t>
+        <w:spacing w:after="0" w:line="276"/>
+      </w:pPr>
+      <w:r>
+        <w:rPr>
+          <w:rFonts w:ascii="Arial" w:cs="Arial" w:eastAsia="Arial" w:hAnsi="Arial"/>
+          <w:sz w:val="22"/>
+          <w:szCs w:val="22"/>
+        </w:rPr>
+        <w:t xml:space="preserve"/>
+      </w:r>
+    </w:p>
+    <w:p>
+      <w:pPr>
+        <w:spacing w:after="0" w:line="276"/>
+      </w:pPr>
+      <w:r>
+        <w:rPr>
+          <w:rFonts w:ascii="Arial" w:cs="Arial" w:eastAsia="Arial" w:hAnsi="Arial"/>
+          <w:b/>
+          <w:bCs/>
+          <w:sz w:val="22"/>
+          <w:szCs w:val="22"/>
+        </w:rPr>
+        <w:t xml:space="preserve">Kyle COMPTON</w:t>
+      </w:r>
+      <w:r>
+        <w:rPr>
+          <w:rFonts w:ascii="Arial" w:cs="Arial" w:eastAsia="Arial" w:hAnsi="Arial"/>
+          <w:sz w:val="22"/>
+          <w:szCs w:val="22"/>
+        </w:rPr>
+        <w:t xml:space="preserve"> and </w:t>
+      </w:r>
+      <w:r>
+        <w:rPr>
+          <w:rFonts w:ascii="Arial" w:cs="Arial" w:eastAsia="Arial" w:hAnsi="Arial"/>
+          <w:b/>
+          <w:bCs/>
+          <w:sz w:val="22"/>
+          <w:szCs w:val="22"/>
+        </w:rPr>
+        <w:t xml:space="preserve">Dion MOORE</w:t>
+      </w:r>
+      <w:r>
+        <w:rPr>
+          <w:rFonts w:ascii="Arial" w:cs="Arial" w:eastAsia="Arial" w:hAnsi="Arial"/>
+          <w:sz w:val="22"/>
+          <w:szCs w:val="22"/>
+        </w:rPr>
+        <w:t xml:space="preserve"> tied for first in the HIGH Flight at 43 / 35 net (E). Kyle birdied 8 for a skin on top of his Team Net share, and Dion took Closest to the Pin on 7. </w:t>
+      </w:r>
+      <w:r>
+        <w:rPr>
+          <w:rFonts w:ascii="Arial" w:cs="Arial" w:eastAsia="Arial" w:hAnsi="Arial"/>
+          <w:b/>
+          <w:bCs/>
+          <w:sz w:val="22"/>
+          <w:szCs w:val="22"/>
+        </w:rPr>
+        <w:t xml:space="preserve">John WADE</w:t>
       </w:r>
       <w:r>
         <w:rPr>
@@ -245,61 +281,74 @@
     </w:p>
     <w:p>
       <w:pPr>
-        <w:spacing w:after="160" w:line="300"/>
-      </w:pPr>
-      <w:r>
-        <w:rPr>
-          <w:rFonts w:ascii="Arial" w:cs="Arial" w:eastAsia="Arial" w:hAnsi="Arial"/>
-          <w:sz w:val="22"/>
-          <w:szCs w:val="22"/>
-        </w:rPr>
-        <w:t xml:space="preserve">The low gross was Luke </w:t>
-      </w:r>
-      <w:r>
-        <w:rPr>
-          <w:rFonts w:ascii="Arial" w:cs="Arial" w:eastAsia="Arial" w:hAnsi="Arial"/>
-          <w:b/>
-          <w:bCs/>
-          <w:sz w:val="22"/>
-          <w:szCs w:val="22"/>
-        </w:rPr>
-        <w:t xml:space="preserve">YOUNGS</w:t>
-      </w:r>
-      <w:r>
-        <w:rPr>
-          <w:rFonts w:ascii="Arial" w:cs="Arial" w:eastAsia="Arial" w:hAnsi="Arial"/>
-          <w:sz w:val="22"/>
-          <w:szCs w:val="22"/>
-        </w:rPr>
-        <w:t xml:space="preserve">' 37 (+2) from the Blues, with Lou's 38, Robert </w:t>
-      </w:r>
-      <w:r>
-        <w:rPr>
-          <w:rFonts w:ascii="Arial" w:cs="Arial" w:eastAsia="Arial" w:hAnsi="Arial"/>
-          <w:b/>
-          <w:bCs/>
-          <w:sz w:val="22"/>
-          <w:szCs w:val="22"/>
-        </w:rPr>
-        <w:t xml:space="preserve">STRAITON</w:t>
-      </w:r>
-      <w:r>
-        <w:rPr>
-          <w:rFonts w:ascii="Arial" w:cs="Arial" w:eastAsia="Arial" w:hAnsi="Arial"/>
-          <w:sz w:val="22"/>
-          <w:szCs w:val="22"/>
-        </w:rPr>
-        <w:t xml:space="preserve">'s 39 and Chris </w:t>
-      </w:r>
-      <w:r>
-        <w:rPr>
-          <w:rFonts w:ascii="Arial" w:cs="Arial" w:eastAsia="Arial" w:hAnsi="Arial"/>
-          <w:b/>
-          <w:bCs/>
-          <w:sz w:val="22"/>
-          <w:szCs w:val="22"/>
-        </w:rPr>
-        <w:t xml:space="preserve">CANNON</w:t>
+        <w:spacing w:after="0" w:line="276"/>
+      </w:pPr>
+      <w:r>
+        <w:rPr>
+          <w:rFonts w:ascii="Arial" w:cs="Arial" w:eastAsia="Arial" w:hAnsi="Arial"/>
+          <w:sz w:val="22"/>
+          <w:szCs w:val="22"/>
+        </w:rPr>
+        <w:t xml:space="preserve"/>
+      </w:r>
+    </w:p>
+    <w:p>
+      <w:pPr>
+        <w:spacing w:after="0" w:line="276"/>
+      </w:pPr>
+      <w:r>
+        <w:rPr>
+          <w:rFonts w:ascii="Arial" w:cs="Arial" w:eastAsia="Arial" w:hAnsi="Arial"/>
+          <w:sz w:val="22"/>
+          <w:szCs w:val="22"/>
+        </w:rPr>
+        <w:t xml:space="preserve">The low gross was </w:t>
+      </w:r>
+      <w:r>
+        <w:rPr>
+          <w:rFonts w:ascii="Arial" w:cs="Arial" w:eastAsia="Arial" w:hAnsi="Arial"/>
+          <w:b/>
+          <w:bCs/>
+          <w:sz w:val="22"/>
+          <w:szCs w:val="22"/>
+        </w:rPr>
+        <w:t xml:space="preserve">Luke YOUNGS</w:t>
+      </w:r>
+      <w:r>
+        <w:rPr>
+          <w:rFonts w:ascii="Arial" w:cs="Arial" w:eastAsia="Arial" w:hAnsi="Arial"/>
+          <w:sz w:val="22"/>
+          <w:szCs w:val="22"/>
+        </w:rPr>
+        <w:t xml:space="preserve">' 37 (+2) from the Blues, with Lou's 38, </w:t>
+      </w:r>
+      <w:r>
+        <w:rPr>
+          <w:rFonts w:ascii="Arial" w:cs="Arial" w:eastAsia="Arial" w:hAnsi="Arial"/>
+          <w:b/>
+          <w:bCs/>
+          <w:sz w:val="22"/>
+          <w:szCs w:val="22"/>
+        </w:rPr>
+        <w:t xml:space="preserve">Robert STRAITON</w:t>
+      </w:r>
+      <w:r>
+        <w:rPr>
+          <w:rFonts w:ascii="Arial" w:cs="Arial" w:eastAsia="Arial" w:hAnsi="Arial"/>
+          <w:sz w:val="22"/>
+          <w:szCs w:val="22"/>
+        </w:rPr>
+        <w:t xml:space="preserve">'s 39 and </w:t>
+      </w:r>
+      <w:r>
+        <w:rPr>
+          <w:rFonts w:ascii="Arial" w:cs="Arial" w:eastAsia="Arial" w:hAnsi="Arial"/>
+          <w:b/>
+          <w:bCs/>
+          <w:sz w:val="22"/>
+          <w:szCs w:val="22"/>
+        </w:rPr>
+        <w:t xml:space="preserve">Chris CANNON</w:t>
       </w:r>
       <w:r>
         <w:rPr>
@@ -312,9 +361,22 @@
     </w:p>
     <w:p>
       <w:pPr>
-        <w:spacing w:after="160" w:line="300"/>
-      </w:pPr>
-      <w:hyperlink w:history="1" r:id="rIdg0jwopsh-pjfua4mimxdq">
+        <w:spacing w:after="0" w:line="276"/>
+      </w:pPr>
+      <w:r>
+        <w:rPr>
+          <w:rFonts w:ascii="Arial" w:cs="Arial" w:eastAsia="Arial" w:hAnsi="Arial"/>
+          <w:sz w:val="22"/>
+          <w:szCs w:val="22"/>
+        </w:rPr>
+        <w:t xml:space="preserve"/>
+      </w:r>
+    </w:p>
+    <w:p>
+      <w:pPr>
+        <w:spacing w:after="0" w:line="276"/>
+      </w:pPr>
+      <w:hyperlink w:history="1" r:id="rIddv9axbrci3yjw-bjljlx0">
         <w:r>
           <w:rPr>
             <w:rStyle w:val="Hyperlink"/>
@@ -331,9 +393,14 @@
     <w:p>
       <w:pPr>
         <w:pBdr>
-          <w:top w:val="single" w:color="D9D9D9" w:sz="6" w:space="10"/>
+          <w:top w:val="single" w:color="A0A0A0" w:sz="6" w:space="1"/>
         </w:pBdr>
-        <w:spacing w:after="120" w:before="240"/>
+        <w:spacing w:after="0" w:line="276"/>
+      </w:pPr>
+    </w:p>
+    <w:p>
+      <w:pPr>
+        <w:spacing w:after="0" w:line="276"/>
       </w:pPr>
       <w:r>
         <w:rPr>
@@ -349,89 +416,94 @@
     </w:p>
     <w:p>
       <w:pPr>
-        <w:spacing w:after="160" w:line="300"/>
-      </w:pPr>
-      <w:r>
-        <w:rPr>
-          <w:rFonts w:ascii="Arial" w:cs="Arial" w:eastAsia="Arial" w:hAnsi="Arial"/>
-          <w:sz w:val="22"/>
-          <w:szCs w:val="22"/>
-        </w:rPr>
-        <w:t xml:space="preserve">Luke </w:t>
-      </w:r>
-      <w:r>
-        <w:rPr>
-          <w:rFonts w:ascii="Arial" w:cs="Arial" w:eastAsia="Arial" w:hAnsi="Arial"/>
-          <w:b/>
-          <w:bCs/>
-          <w:sz w:val="22"/>
-          <w:szCs w:val="22"/>
-        </w:rPr>
-        <w:t xml:space="preserve">YOUNGS</w:t>
-      </w:r>
-      <w:r>
-        <w:rPr>
-          <w:rFonts w:ascii="Arial" w:cs="Arial" w:eastAsia="Arial" w:hAnsi="Arial"/>
-          <w:sz w:val="22"/>
-          <w:szCs w:val="22"/>
-        </w:rPr>
-        <w:t xml:space="preserve"> leads at 62 with John </w:t>
-      </w:r>
-      <w:r>
-        <w:rPr>
-          <w:rFonts w:ascii="Arial" w:cs="Arial" w:eastAsia="Arial" w:hAnsi="Arial"/>
-          <w:b/>
-          <w:bCs/>
-          <w:sz w:val="22"/>
-          <w:szCs w:val="22"/>
-        </w:rPr>
-        <w:t xml:space="preserve">WADE</w:t>
-      </w:r>
-      <w:r>
-        <w:rPr>
-          <w:rFonts w:ascii="Arial" w:cs="Arial" w:eastAsia="Arial" w:hAnsi="Arial"/>
-          <w:sz w:val="22"/>
-          <w:szCs w:val="22"/>
-        </w:rPr>
-        <w:t xml:space="preserve"> second at 50. Lou </w:t>
-      </w:r>
-      <w:r>
-        <w:rPr>
-          <w:rFonts w:ascii="Arial" w:cs="Arial" w:eastAsia="Arial" w:hAnsi="Arial"/>
-          <w:b/>
-          <w:bCs/>
-          <w:sz w:val="22"/>
-          <w:szCs w:val="22"/>
-        </w:rPr>
-        <w:t xml:space="preserve">SCHNEIDER</w:t>
-      </w:r>
-      <w:r>
-        <w:rPr>
-          <w:rFonts w:ascii="Arial" w:cs="Arial" w:eastAsia="Arial" w:hAnsi="Arial"/>
-          <w:sz w:val="22"/>
-          <w:szCs w:val="22"/>
-        </w:rPr>
-        <w:t xml:space="preserve"> jumped from 24 to 36 with Tuesday's win, and Chris </w:t>
-      </w:r>
-      <w:r>
-        <w:rPr>
-          <w:rFonts w:ascii="Arial" w:cs="Arial" w:eastAsia="Arial" w:hAnsi="Arial"/>
-          <w:b/>
-          <w:bCs/>
-          <w:sz w:val="22"/>
-          <w:szCs w:val="22"/>
-        </w:rPr>
-        <w:t xml:space="preserve">CANNON</w:t>
-      </w:r>
-      <w:r>
-        <w:rPr>
-          <w:rFonts w:ascii="Arial" w:cs="Arial" w:eastAsia="Arial" w:hAnsi="Arial"/>
-          <w:sz w:val="22"/>
-          <w:szCs w:val="22"/>
-        </w:rPr>
-        <w:t xml:space="preserve"> is at 28. Best 6 of the fall Tuesdays plus the Fall Championship at Kissing Tree on Oct 31. Your points are being tallied; activate them by BUYING IN. Green in the standings means you are already in. </w:t>
-      </w:r>
-      <w:hyperlink w:history="1" r:id="rId7gg21fubojiqsqftyids8">
+        <w:spacing w:after="0" w:line="276"/>
+      </w:pPr>
+      <w:r>
+        <w:rPr>
+          <w:rFonts w:ascii="Arial" w:cs="Arial" w:eastAsia="Arial" w:hAnsi="Arial"/>
+          <w:sz w:val="22"/>
+          <w:szCs w:val="22"/>
+        </w:rPr>
+        <w:t xml:space="preserve"/>
+      </w:r>
+    </w:p>
+    <w:p>
+      <w:pPr>
+        <w:spacing w:after="0" w:line="276"/>
+      </w:pPr>
+      <w:r>
+        <w:rPr>
+          <w:rFonts w:ascii="Arial" w:cs="Arial" w:eastAsia="Arial" w:hAnsi="Arial"/>
+          <w:b/>
+          <w:bCs/>
+          <w:sz w:val="22"/>
+          <w:szCs w:val="22"/>
+        </w:rPr>
+        <w:t xml:space="preserve">Luke YOUNGS</w:t>
+      </w:r>
+      <w:r>
+        <w:rPr>
+          <w:rFonts w:ascii="Arial" w:cs="Arial" w:eastAsia="Arial" w:hAnsi="Arial"/>
+          <w:sz w:val="22"/>
+          <w:szCs w:val="22"/>
+        </w:rPr>
+        <w:t xml:space="preserve"> leads at 62 with </w:t>
+      </w:r>
+      <w:r>
+        <w:rPr>
+          <w:rFonts w:ascii="Arial" w:cs="Arial" w:eastAsia="Arial" w:hAnsi="Arial"/>
+          <w:b/>
+          <w:bCs/>
+          <w:sz w:val="22"/>
+          <w:szCs w:val="22"/>
+        </w:rPr>
+        <w:t xml:space="preserve">John WADE</w:t>
+      </w:r>
+      <w:r>
+        <w:rPr>
+          <w:rFonts w:ascii="Arial" w:cs="Arial" w:eastAsia="Arial" w:hAnsi="Arial"/>
+          <w:sz w:val="22"/>
+          <w:szCs w:val="22"/>
+        </w:rPr>
+        <w:t xml:space="preserve"> second at 50. </w:t>
+      </w:r>
+      <w:r>
+        <w:rPr>
+          <w:rFonts w:ascii="Arial" w:cs="Arial" w:eastAsia="Arial" w:hAnsi="Arial"/>
+          <w:b/>
+          <w:bCs/>
+          <w:sz w:val="22"/>
+          <w:szCs w:val="22"/>
+        </w:rPr>
+        <w:t xml:space="preserve">Lou SCHNEIDER</w:t>
+      </w:r>
+      <w:r>
+        <w:rPr>
+          <w:rFonts w:ascii="Arial" w:cs="Arial" w:eastAsia="Arial" w:hAnsi="Arial"/>
+          <w:sz w:val="22"/>
+          <w:szCs w:val="22"/>
+        </w:rPr>
+        <w:t xml:space="preserve"> jumped from 24 to 36 with Tuesday's win, and </w:t>
+      </w:r>
+      <w:r>
+        <w:rPr>
+          <w:rFonts w:ascii="Arial" w:cs="Arial" w:eastAsia="Arial" w:hAnsi="Arial"/>
+          <w:b/>
+          <w:bCs/>
+          <w:sz w:val="22"/>
+          <w:szCs w:val="22"/>
+        </w:rPr>
+        <w:t xml:space="preserve">Chris CANNON</w:t>
+      </w:r>
+      <w:r>
+        <w:rPr>
+          <w:rFonts w:ascii="Arial" w:cs="Arial" w:eastAsia="Arial" w:hAnsi="Arial"/>
+          <w:sz w:val="22"/>
+          <w:szCs w:val="22"/>
+        </w:rPr>
+        <w:t xml:space="preserve"> is at 28. Best 6 of the fall Tuesdays plus the Fall Championship at Kissing Tree on Oct 31. Your points are being tallied; activate them by </w:t>
+      </w:r>
+      <w:hyperlink w:history="1" r:id="rIdlbseuhs2uo_djefz2qagm">
         <w:r>
           <w:rPr>
             <w:rStyle w:val="Hyperlink"/>
@@ -441,78 +513,36 @@
             <w:sz w:val="22"/>
             <w:szCs w:val="22"/>
           </w:rPr>
-          <w:t xml:space="preserve">CURRENT STANDINGS</w:t>
+          <w:t xml:space="preserve">BUYING IN</w:t>
         </w:r>
       </w:hyperlink>
-    </w:p>
-    <w:p>
-      <w:pPr>
-        <w:pBdr>
-          <w:top w:val="single" w:color="D9D9D9" w:sz="6" w:space="10"/>
-        </w:pBdr>
-        <w:spacing w:after="120" w:before="240"/>
-      </w:pPr>
-      <w:r>
-        <w:rPr>
-          <w:rFonts w:ascii="Arial" w:cs="Arial" w:eastAsia="Arial" w:hAnsi="Arial"/>
-          <w:b/>
-          <w:bCs/>
-          <w:caps/>
-          <w:sz w:val="22"/>
-          <w:szCs w:val="22"/>
-        </w:rPr>
-        <w:t xml:space="preserve">SEPTEMBER POINTS.</w:t>
-      </w:r>
-    </w:p>
-    <w:p>
-      <w:pPr>
-        <w:spacing w:after="160" w:line="300"/>
-      </w:pPr>
-      <w:r>
-        <w:rPr>
-          <w:rFonts w:ascii="Arial" w:cs="Arial" w:eastAsia="Arial" w:hAnsi="Arial"/>
-          <w:sz w:val="22"/>
-          <w:szCs w:val="22"/>
-        </w:rPr>
-        <w:t xml:space="preserve">Every member is in, no buy-in. Winner takes all — $1 per TGF member at month end. Luke </w:t>
-      </w:r>
-      <w:r>
-        <w:rPr>
-          <w:rFonts w:ascii="Arial" w:cs="Arial" w:eastAsia="Arial" w:hAnsi="Arial"/>
-          <w:b/>
-          <w:bCs/>
-          <w:sz w:val="22"/>
-          <w:szCs w:val="22"/>
-        </w:rPr>
-        <w:t xml:space="preserve">YOUNGS</w:t>
-      </w:r>
-      <w:r>
-        <w:rPr>
-          <w:rFonts w:ascii="Arial" w:cs="Arial" w:eastAsia="Arial" w:hAnsi="Arial"/>
-          <w:sz w:val="22"/>
-          <w:szCs w:val="22"/>
-        </w:rPr>
-        <w:t xml:space="preserve"> went into the last Tuesday a point behind San Antonio's Luke Mazanec, 57 to 58, outscored him seven to four at Star Ranch, and </w:t>
-      </w:r>
-      <w:r>
-        <w:rPr>
-          <w:rFonts w:ascii="Arial" w:cs="Arial" w:eastAsia="Arial" w:hAnsi="Arial"/>
-          <w:b/>
-          <w:bCs/>
-          <w:sz w:val="22"/>
-          <w:szCs w:val="22"/>
-        </w:rPr>
-        <w:t xml:space="preserve">takes September, 64 to 62 — $138</w:t>
-      </w:r>
-      <w:r>
-        <w:rPr>
-          <w:rFonts w:ascii="Arial" w:cs="Arial" w:eastAsia="Arial" w:hAnsi="Arial"/>
-          <w:sz w:val="22"/>
-          <w:szCs w:val="22"/>
-        </w:rPr>
-        <w:t xml:space="preserve">. October starts fresh Tuesday. </w:t>
-      </w:r>
-      <w:hyperlink w:history="1" r:id="rIdkn5ffi2vciyccgm7nxlpg">
+      <w:r>
+        <w:rPr>
+          <w:rFonts w:ascii="Arial" w:cs="Arial" w:eastAsia="Arial" w:hAnsi="Arial"/>
+          <w:sz w:val="22"/>
+          <w:szCs w:val="22"/>
+        </w:rPr>
+        <w:t xml:space="preserve">. Green in the standings means you are already in.</w:t>
+      </w:r>
+    </w:p>
+    <w:p>
+      <w:pPr>
+        <w:spacing w:after="0" w:line="276"/>
+      </w:pPr>
+      <w:r>
+        <w:rPr>
+          <w:rFonts w:ascii="Arial" w:cs="Arial" w:eastAsia="Arial" w:hAnsi="Arial"/>
+          <w:sz w:val="22"/>
+          <w:szCs w:val="22"/>
+        </w:rPr>
+        <w:t xml:space="preserve"/>
+      </w:r>
+    </w:p>
+    <w:p>
+      <w:pPr>
+        <w:spacing w:after="0" w:line="276"/>
+      </w:pPr>
+      <w:hyperlink w:history="1" r:id="rId3emzzqsrgfaiqjsa-0x2g">
         <w:r>
           <w:rPr>
             <w:rStyle w:val="Hyperlink"/>
@@ -522,27 +552,184 @@
             <w:sz w:val="22"/>
             <w:szCs w:val="22"/>
           </w:rPr>
-          <w:t xml:space="preserve">Standings</w:t>
+          <w:t xml:space="preserve">AUSTIN STANDINGS</w:t>
         </w:r>
       </w:hyperlink>
-    </w:p>
-    <w:p>
-      <w:pPr>
-        <w:spacing w:after="160" w:line="300"/>
-      </w:pPr>
-      <w:r>
-        <w:rPr>
-          <w:rFonts w:ascii="Arial" w:cs="Arial" w:eastAsia="Arial" w:hAnsi="Arial"/>
-          <w:sz w:val="22"/>
-          <w:szCs w:val="22"/>
-        </w:rPr>
-        <w:t xml:space="preserve">BTW... the </w:t>
-      </w:r>
-      <w:r>
-        <w:rPr>
-          <w:rFonts w:ascii="Arial" w:cs="Arial" w:eastAsia="Arial" w:hAnsi="Arial"/>
-          <w:b/>
-          <w:bCs/>
+      <w:r>
+        <w:rPr>
+          <w:rFonts w:ascii="Arial" w:cs="Arial" w:eastAsia="Arial" w:hAnsi="Arial"/>
+          <w:sz w:val="22"/>
+          <w:szCs w:val="22"/>
+        </w:rPr>
+        <w:t xml:space="preserve"> | </w:t>
+      </w:r>
+      <w:hyperlink w:history="1" r:id="rIdue1dumq_o7ftlmoxboidd">
+        <w:r>
+          <w:rPr>
+            <w:rStyle w:val="Hyperlink"/>
+            <w:rFonts w:ascii="Arial" w:cs="Arial" w:eastAsia="Arial" w:hAnsi="Arial"/>
+            <w:b/>
+            <w:bCs/>
+            <w:sz w:val="22"/>
+            <w:szCs w:val="22"/>
+          </w:rPr>
+          <w:t xml:space="preserve">SAN ANTONIO STANDINGS</w:t>
+        </w:r>
+      </w:hyperlink>
+    </w:p>
+    <w:p>
+      <w:pPr>
+        <w:pBdr>
+          <w:top w:val="single" w:color="A0A0A0" w:sz="6" w:space="1"/>
+        </w:pBdr>
+        <w:spacing w:after="0" w:line="276"/>
+      </w:pPr>
+    </w:p>
+    <w:p>
+      <w:pPr>
+        <w:spacing w:after="0" w:line="276"/>
+      </w:pPr>
+      <w:r>
+        <w:rPr>
+          <w:rFonts w:ascii="Arial" w:cs="Arial" w:eastAsia="Arial" w:hAnsi="Arial"/>
+          <w:b/>
+          <w:bCs/>
+          <w:caps/>
+          <w:sz w:val="22"/>
+          <w:szCs w:val="22"/>
+        </w:rPr>
+        <w:t xml:space="preserve">SEPTEMBER POINTS IS FINAL.</w:t>
+      </w:r>
+    </w:p>
+    <w:p>
+      <w:pPr>
+        <w:spacing w:after="0" w:line="276"/>
+      </w:pPr>
+      <w:r>
+        <w:rPr>
+          <w:rFonts w:ascii="Arial" w:cs="Arial" w:eastAsia="Arial" w:hAnsi="Arial"/>
+          <w:sz w:val="22"/>
+          <w:szCs w:val="22"/>
+        </w:rPr>
+        <w:t xml:space="preserve"/>
+      </w:r>
+    </w:p>
+    <w:p>
+      <w:pPr>
+        <w:spacing w:after="0" w:line="276"/>
+      </w:pPr>
+      <w:r>
+        <w:rPr>
+          <w:rFonts w:ascii="Arial" w:cs="Arial" w:eastAsia="Arial" w:hAnsi="Arial"/>
+          <w:sz w:val="22"/>
+          <w:szCs w:val="22"/>
+        </w:rPr>
+        <w:t xml:space="preserve">Every member is in automatically, no buy-in required. Winner takes all — $1 per TGF member at month end. </w:t>
+      </w:r>
+      <w:r>
+        <w:rPr>
+          <w:rFonts w:ascii="Arial" w:cs="Arial" w:eastAsia="Arial" w:hAnsi="Arial"/>
+          <w:b/>
+          <w:bCs/>
+          <w:sz w:val="22"/>
+          <w:szCs w:val="22"/>
+        </w:rPr>
+        <w:t xml:space="preserve">Luke YOUNGS</w:t>
+      </w:r>
+      <w:r>
+        <w:rPr>
+          <w:rFonts w:ascii="Arial" w:cs="Arial" w:eastAsia="Arial" w:hAnsi="Arial"/>
+          <w:sz w:val="22"/>
+          <w:szCs w:val="22"/>
+        </w:rPr>
+        <w:t xml:space="preserve"> went into the last Tuesday a point behind San Antonio's </w:t>
+      </w:r>
+      <w:r>
+        <w:rPr>
+          <w:rFonts w:ascii="Arial" w:cs="Arial" w:eastAsia="Arial" w:hAnsi="Arial"/>
+          <w:b/>
+          <w:bCs/>
+          <w:sz w:val="22"/>
+          <w:szCs w:val="22"/>
+        </w:rPr>
+        <w:t xml:space="preserve">Luke MAZANEC</w:t>
+      </w:r>
+      <w:r>
+        <w:rPr>
+          <w:rFonts w:ascii="Arial" w:cs="Arial" w:eastAsia="Arial" w:hAnsi="Arial"/>
+          <w:sz w:val="22"/>
+          <w:szCs w:val="22"/>
+        </w:rPr>
+        <w:t xml:space="preserve">, 57 to 58, outscored him seven to four at Star Ranch, and </w:t>
+      </w:r>
+      <w:r>
+        <w:rPr>
+          <w:rFonts w:ascii="Arial" w:cs="Arial" w:eastAsia="Arial" w:hAnsi="Arial"/>
+          <w:b/>
+          <w:bCs/>
+          <w:sz w:val="22"/>
+          <w:szCs w:val="22"/>
+        </w:rPr>
+        <w:t xml:space="preserve">takes September, 64 to 62 — $138</w:t>
+      </w:r>
+      <w:r>
+        <w:rPr>
+          <w:rFonts w:ascii="Arial" w:cs="Arial" w:eastAsia="Arial" w:hAnsi="Arial"/>
+          <w:sz w:val="22"/>
+          <w:szCs w:val="22"/>
+        </w:rPr>
+        <w:t xml:space="preserve">. Well played, both of you. October starts fresh Tuesday.</w:t>
+      </w:r>
+    </w:p>
+    <w:p>
+      <w:pPr>
+        <w:spacing w:after="0" w:line="276"/>
+      </w:pPr>
+      <w:r>
+        <w:rPr>
+          <w:rFonts w:ascii="Arial" w:cs="Arial" w:eastAsia="Arial" w:hAnsi="Arial"/>
+          <w:sz w:val="22"/>
+          <w:szCs w:val="22"/>
+        </w:rPr>
+        <w:t xml:space="preserve"/>
+      </w:r>
+    </w:p>
+    <w:p>
+      <w:pPr>
+        <w:spacing w:after="0" w:line="276"/>
+      </w:pPr>
+      <w:hyperlink w:history="1" r:id="rId57tmofb3vbh1zikvtdpf5">
+        <w:r>
+          <w:rPr>
+            <w:rStyle w:val="Hyperlink"/>
+            <w:rFonts w:ascii="Arial" w:cs="Arial" w:eastAsia="Arial" w:hAnsi="Arial"/>
+            <w:b/>
+            <w:bCs/>
+            <w:sz w:val="22"/>
+            <w:szCs w:val="22"/>
+          </w:rPr>
+          <w:t xml:space="preserve">FINAL SEPTEMBER STANDINGS</w:t>
+        </w:r>
+      </w:hyperlink>
+    </w:p>
+    <w:p>
+      <w:pPr>
+        <w:pBdr>
+          <w:top w:val="single" w:color="A0A0A0" w:sz="6" w:space="1"/>
+        </w:pBdr>
+        <w:spacing w:after="0" w:line="276"/>
+      </w:pPr>
+    </w:p>
+    <w:p>
+      <w:pPr>
+        <w:spacing w:after="0" w:line="276"/>
+      </w:pPr>
+      <w:r>
+        <w:rPr>
+          <w:rFonts w:ascii="Arial" w:cs="Arial" w:eastAsia="Arial" w:hAnsi="Arial"/>
+          <w:b/>
+          <w:bCs/>
+          <w:color w:val="27AE60"/>
           <w:sz w:val="22"/>
           <w:szCs w:val="22"/>
         </w:rPr>
@@ -551,6 +738,7 @@
       <w:r>
         <w:rPr>
           <w:rFonts w:ascii="Arial" w:cs="Arial" w:eastAsia="Arial" w:hAnsi="Arial"/>
+          <w:color w:val="27AE60"/>
           <w:sz w:val="22"/>
           <w:szCs w:val="22"/>
         </w:rPr>
@@ -560,9 +748,14 @@
     <w:p>
       <w:pPr>
         <w:pBdr>
-          <w:top w:val="single" w:color="D9D9D9" w:sz="6" w:space="10"/>
+          <w:top w:val="single" w:color="A0A0A0" w:sz="6" w:space="1"/>
         </w:pBdr>
-        <w:spacing w:after="120" w:before="240"/>
+        <w:spacing w:after="0" w:line="276"/>
+      </w:pPr>
+    </w:p>
+    <w:p>
+      <w:pPr>
+        <w:spacing w:after="0" w:line="276"/>
       </w:pPr>
       <w:r>
         <w:rPr>
@@ -578,7 +771,20 @@
     </w:p>
     <w:p>
       <w:pPr>
-        <w:spacing w:after="160" w:line="300"/>
+        <w:spacing w:after="0" w:line="276"/>
+      </w:pPr>
+      <w:r>
+        <w:rPr>
+          <w:rFonts w:ascii="Arial" w:cs="Arial" w:eastAsia="Arial" w:hAnsi="Arial"/>
+          <w:sz w:val="22"/>
+          <w:szCs w:val="22"/>
+        </w:rPr>
+        <w:t xml:space="preserve"/>
+      </w:r>
+    </w:p>
+    <w:p>
+      <w:pPr>
+        <w:spacing w:after="0" w:line="276"/>
       </w:pPr>
       <w:r>
         <w:rPr>
@@ -595,7 +801,7 @@
           <w:sz w:val="22"/>
           <w:szCs w:val="22"/>
         </w:rPr>
-        <w:t xml:space="preserve"> of us </w:t>
+        <w:t xml:space="preserve"> of us headed over to </w:t>
       </w:r>
       <w:r>
         <w:rPr>
@@ -612,15 +818,20 @@
           <w:sz w:val="22"/>
           <w:szCs w:val="22"/>
         </w:rPr>
-        <w:t xml:space="preserve">. It's the best part, and it's yours if you want it.</w:t>
+        <w:t xml:space="preserve"> for good food, good drinks, and good conversation.</w:t>
       </w:r>
     </w:p>
     <w:p>
       <w:pPr>
         <w:pBdr>
-          <w:top w:val="single" w:color="D9D9D9" w:sz="6" w:space="10"/>
+          <w:top w:val="single" w:color="A0A0A0" w:sz="6" w:space="1"/>
         </w:pBdr>
-        <w:spacing w:after="120" w:before="240"/>
+        <w:spacing w:after="0" w:line="276"/>
+      </w:pPr>
+    </w:p>
+    <w:p>
+      <w:pPr>
+        <w:spacing w:after="0" w:line="276"/>
       </w:pPr>
       <w:r>
         <w:rPr>
@@ -632,6 +843,19 @@
           <w:szCs w:val="22"/>
         </w:rPr>
         <w:t xml:space="preserve">UP NEXT.</w:t>
+      </w:r>
+    </w:p>
+    <w:p>
+      <w:pPr>
+        <w:spacing w:after="0" w:line="276"/>
+      </w:pPr>
+      <w:r>
+        <w:rPr>
+          <w:rFonts w:ascii="Arial" w:cs="Arial" w:eastAsia="Arial" w:hAnsi="Arial"/>
+          <w:sz w:val="22"/>
+          <w:szCs w:val="22"/>
+        </w:rPr>
+        <w:t xml:space="preserve"/>
       </w:r>
     </w:p>
     <w:p>
@@ -641,7 +865,7 @@
           <w:ilvl w:val="0"/>
           <w:numId w:val="2"/>
         </w:numPr>
-        <w:spacing w:after="80" w:line="300"/>
+        <w:spacing w:after="0" w:line="276"/>
       </w:pPr>
       <w:r>
         <w:rPr>
@@ -704,7 +928,7 @@
           <w:ilvl w:val="0"/>
           <w:numId w:val="2"/>
         </w:numPr>
-        <w:spacing w:after="80" w:line="300"/>
+        <w:spacing w:after="0" w:line="276"/>
       </w:pPr>
       <w:r>
         <w:rPr>
@@ -732,7 +956,7 @@
         </w:rPr>
         <w:t xml:space="preserve"> | 5:00p Shot | </w:t>
       </w:r>
-      <w:hyperlink w:history="1" r:id="rIdvejyynm8l9vy6ormuc-ga">
+      <w:hyperlink w:history="1" r:id="rId0xlqm1x7rl0hatwgb4td7">
         <w:r>
           <w:rPr>
             <w:rStyle w:val="Hyperlink"/>
@@ -753,15 +977,33 @@
           <w:ilvl w:val="0"/>
           <w:numId w:val="2"/>
         </w:numPr>
-        <w:spacing w:after="80" w:line="300"/>
-      </w:pPr>
-      <w:r>
-        <w:rPr>
-          <w:rFonts w:ascii="Arial" w:cs="Arial" w:eastAsia="Arial" w:hAnsi="Arial"/>
-          <w:sz w:val="22"/>
-          <w:szCs w:val="22"/>
-        </w:rPr>
-        <w:t xml:space="preserve">Sat, Oct 10 | LONE STAR CUP | The Hideout — Austin vs San Antonio. Qualifiers Only</w:t>
+        <w:spacing w:after="0" w:line="276"/>
+      </w:pPr>
+      <w:r>
+        <w:rPr>
+          <w:rFonts w:ascii="Arial" w:cs="Arial" w:eastAsia="Arial" w:hAnsi="Arial"/>
+          <w:sz w:val="22"/>
+          <w:szCs w:val="22"/>
+        </w:rPr>
+        <w:t xml:space="preserve">Sat, Oct 10 | </w:t>
+      </w:r>
+      <w:r>
+        <w:rPr>
+          <w:rFonts w:ascii="Arial" w:cs="Arial" w:eastAsia="Arial" w:hAnsi="Arial"/>
+          <w:b/>
+          <w:bCs/>
+          <w:sz w:val="22"/>
+          <w:szCs w:val="22"/>
+        </w:rPr>
+        <w:t xml:space="preserve">LONE STAR CUP</w:t>
+      </w:r>
+      <w:r>
+        <w:rPr>
+          <w:rFonts w:ascii="Arial" w:cs="Arial" w:eastAsia="Arial" w:hAnsi="Arial"/>
+          <w:sz w:val="22"/>
+          <w:szCs w:val="22"/>
+        </w:rPr>
+        <w:t xml:space="preserve"> | The Hideout — Austin vs San Antonio. Qualifiers Only</w:t>
       </w:r>
     </w:p>
     <w:p>
@@ -771,7 +1013,7 @@
           <w:ilvl w:val="0"/>
           <w:numId w:val="2"/>
         </w:numPr>
-        <w:spacing w:after="80" w:line="300"/>
+        <w:spacing w:after="0" w:line="276"/>
       </w:pPr>
       <w:r>
         <w:rPr>
@@ -829,7 +1071,20 @@
     </w:p>
     <w:p>
       <w:pPr>
-        <w:spacing w:after="160" w:line="300"/>
+        <w:spacing w:after="0" w:line="276"/>
+      </w:pPr>
+      <w:r>
+        <w:rPr>
+          <w:rFonts w:ascii="Arial" w:cs="Arial" w:eastAsia="Arial" w:hAnsi="Arial"/>
+          <w:sz w:val="22"/>
+          <w:szCs w:val="22"/>
+        </w:rPr>
+        <w:t xml:space="preserve"/>
+      </w:r>
+    </w:p>
+    <w:p>
+      <w:pPr>
+        <w:spacing w:after="0" w:line="276"/>
       </w:pPr>
       <w:r>
         <w:rPr>
@@ -842,15 +1097,41 @@
     </w:p>
     <w:p>
       <w:pPr>
-        <w:spacing w:after="160" w:line="300"/>
-      </w:pPr>
-      <w:r>
-        <w:rPr>
-          <w:rFonts w:ascii="Arial" w:cs="Arial" w:eastAsia="Arial" w:hAnsi="Arial"/>
-          <w:sz w:val="22"/>
-          <w:szCs w:val="22"/>
-        </w:rPr>
-        <w:t xml:space="preserve">Robert Straiton The Golf Fellowship — Austin</w:t>
+        <w:spacing w:after="0" w:line="276"/>
+      </w:pPr>
+      <w:r>
+        <w:rPr>
+          <w:rFonts w:ascii="Arial" w:cs="Arial" w:eastAsia="Arial" w:hAnsi="Arial"/>
+          <w:sz w:val="22"/>
+          <w:szCs w:val="22"/>
+        </w:rPr>
+        <w:t xml:space="preserve"/>
+      </w:r>
+    </w:p>
+    <w:p>
+      <w:pPr>
+        <w:spacing w:after="0" w:line="276"/>
+      </w:pPr>
+      <w:r>
+        <w:rPr>
+          <w:rFonts w:ascii="Arial" w:cs="Arial" w:eastAsia="Arial" w:hAnsi="Arial"/>
+          <w:sz w:val="22"/>
+          <w:szCs w:val="22"/>
+        </w:rPr>
+        <w:t xml:space="preserve">Robert Straiton</w:t>
+      </w:r>
+    </w:p>
+    <w:p>
+      <w:pPr>
+        <w:spacing w:after="0" w:line="276"/>
+      </w:pPr>
+      <w:r>
+        <w:rPr>
+          <w:rFonts w:ascii="Arial" w:cs="Arial" w:eastAsia="Arial" w:hAnsi="Arial"/>
+          <w:sz w:val="22"/>
+          <w:szCs w:val="22"/>
+        </w:rPr>
+        <w:t xml:space="preserve">The Golf Fellowship — Austin</w:t>
       </w:r>
     </w:p>
     <w:sectPr>

</xml_diff>